<commit_message>
Sửa trang đơn hàng
</commit_message>
<xml_diff>
--- a/docs/atlas/ATL-12_Don-hang-ban.docx
+++ b/docs/atlas/ATL-12_Don-hang-ban.docx
@@ -2131,6 +2131,393 @@
           </w:p>
         </w:tc>
       </w:tr>
+      <w:tr>
+        <w:trPr>
+          <w:cantSplit/>
+        </w:trPr>
+        <w:tc>
+          <w:tcPr>
+            <w:tcW w:type="dxa" w:w="596"/>
+            <w:tcBorders>
+              <w:top w:val="single" w:color="A6A6A6" w:sz="4"/>
+              <w:left w:val="single" w:color="A6A6A6" w:sz="4"/>
+              <w:bottom w:val="single" w:color="A6A6A6" w:sz="4"/>
+              <w:right w:val="single" w:color="A6A6A6" w:sz="4"/>
+            </w:tcBorders>
+            <w:tcMar>
+              <w:top w:type="dxa" w:w="60"/>
+              <w:left w:type="dxa" w:w="100"/>
+              <w:bottom w:type="dxa" w:w="60"/>
+              <w:right w:type="dxa" w:w="100"/>
+            </w:tcMar>
+            <w:vAlign w:val="top"/>
+          </w:tcPr>
+          <w:p>
+            <w:pPr>
+              <w:spacing w:after="20" w:line="270"/>
+            </w:pPr>
+            <w:r>
+              <w:rPr>
+                <w:rFonts w:ascii="Arial" w:cs="Arial" w:eastAsia="Arial" w:hAnsi="Arial"/>
+                <w:sz w:val="19"/>
+                <w:szCs w:val="19"/>
+              </w:rPr>
+              <w:t xml:space="preserve">9</w:t>
+            </w:r>
+          </w:p>
+        </w:tc>
+        <w:tc>
+          <w:tcPr>
+            <w:tcW w:type="dxa" w:w="1490"/>
+            <w:tcBorders>
+              <w:top w:val="single" w:color="A6A6A6" w:sz="4"/>
+              <w:left w:val="single" w:color="A6A6A6" w:sz="4"/>
+              <w:bottom w:val="single" w:color="A6A6A6" w:sz="4"/>
+              <w:right w:val="single" w:color="A6A6A6" w:sz="4"/>
+            </w:tcBorders>
+            <w:tcMar>
+              <w:top w:type="dxa" w:w="60"/>
+              <w:left w:type="dxa" w:w="100"/>
+              <w:bottom w:type="dxa" w:w="60"/>
+              <w:right w:type="dxa" w:w="100"/>
+            </w:tcMar>
+            <w:vAlign w:val="top"/>
+          </w:tcPr>
+          <w:p>
+            <w:pPr>
+              <w:spacing w:after="20" w:line="270"/>
+            </w:pPr>
+            <w:r>
+              <w:rPr>
+                <w:rFonts w:ascii="Arial" w:cs="Arial" w:eastAsia="Arial" w:hAnsi="Arial"/>
+                <w:sz w:val="19"/>
+                <w:szCs w:val="19"/>
+              </w:rPr>
+              <w:t xml:space="preserve">Sale</w:t>
+            </w:r>
+          </w:p>
+        </w:tc>
+        <w:tc>
+          <w:tcPr>
+            <w:tcW w:type="dxa" w:w="3974"/>
+            <w:tcBorders>
+              <w:top w:val="single" w:color="A6A6A6" w:sz="4"/>
+              <w:left w:val="single" w:color="A6A6A6" w:sz="4"/>
+              <w:bottom w:val="single" w:color="A6A6A6" w:sz="4"/>
+              <w:right w:val="single" w:color="A6A6A6" w:sz="4"/>
+            </w:tcBorders>
+            <w:tcMar>
+              <w:top w:type="dxa" w:w="60"/>
+              <w:left w:type="dxa" w:w="100"/>
+              <w:bottom w:type="dxa" w:w="60"/>
+              <w:right w:type="dxa" w:w="100"/>
+            </w:tcMar>
+            <w:vAlign w:val="top"/>
+          </w:tcPr>
+          <w:p>
+            <w:pPr>
+              <w:spacing w:after="20" w:line="270"/>
+            </w:pPr>
+            <w:r>
+              <w:rPr>
+                <w:rFonts w:ascii="Arial" w:cs="Arial" w:eastAsia="Arial" w:hAnsi="Arial"/>
+                <w:sz w:val="19"/>
+                <w:szCs w:val="19"/>
+              </w:rPr>
+              <w:t xml:space="preserve">Chọn "Thu tiền ngay" ở thanh Thu tiền (đầu chứng từ) và tài khoản nhận tiền.</w:t>
+            </w:r>
+          </w:p>
+        </w:tc>
+        <w:tc>
+          <w:tcPr>
+            <w:tcW w:type="dxa" w:w="3578"/>
+            <w:tcBorders>
+              <w:top w:val="single" w:color="A6A6A6" w:sz="4"/>
+              <w:left w:val="single" w:color="A6A6A6" w:sz="4"/>
+              <w:bottom w:val="single" w:color="A6A6A6" w:sz="4"/>
+              <w:right w:val="single" w:color="A6A6A6" w:sz="4"/>
+            </w:tcBorders>
+            <w:tcMar>
+              <w:top w:type="dxa" w:w="60"/>
+              <w:left w:type="dxa" w:w="100"/>
+              <w:bottom w:type="dxa" w:w="60"/>
+              <w:right w:type="dxa" w:w="100"/>
+            </w:tcMar>
+            <w:vAlign w:val="top"/>
+          </w:tcPr>
+          <w:p>
+            <w:pPr>
+              <w:spacing w:after="20" w:line="270"/>
+            </w:pPr>
+            <w:r>
+              <w:rPr>
+                <w:rFonts w:ascii="Arial" w:cs="Arial" w:eastAsia="Arial" w:hAnsi="Arial"/>
+                <w:sz w:val="19"/>
+                <w:szCs w:val="19"/>
+              </w:rPr>
+              <w:t xml:space="preserve">Đơn nhớ lựa chọn. Mặc định là "Chưa thu tiền". Chỉ đổi được khi đơn còn sửa được.</w:t>
+            </w:r>
+          </w:p>
+        </w:tc>
+      </w:tr>
+      <w:tr>
+        <w:trPr>
+          <w:cantSplit/>
+        </w:trPr>
+        <w:tc>
+          <w:tcPr>
+            <w:tcW w:type="dxa" w:w="596"/>
+            <w:tcBorders>
+              <w:top w:val="single" w:color="A6A6A6" w:sz="4"/>
+              <w:left w:val="single" w:color="A6A6A6" w:sz="4"/>
+              <w:bottom w:val="single" w:color="A6A6A6" w:sz="4"/>
+              <w:right w:val="single" w:color="A6A6A6" w:sz="4"/>
+            </w:tcBorders>
+            <w:tcMar>
+              <w:top w:type="dxa" w:w="60"/>
+              <w:left w:type="dxa" w:w="100"/>
+              <w:bottom w:type="dxa" w:w="60"/>
+              <w:right w:type="dxa" w:w="100"/>
+            </w:tcMar>
+            <w:vAlign w:val="top"/>
+          </w:tcPr>
+          <w:p>
+            <w:pPr>
+              <w:spacing w:after="20" w:line="270"/>
+            </w:pPr>
+            <w:r>
+              <w:rPr>
+                <w:rFonts w:ascii="Arial" w:cs="Arial" w:eastAsia="Arial" w:hAnsi="Arial"/>
+                <w:sz w:val="19"/>
+                <w:szCs w:val="19"/>
+              </w:rPr>
+              <w:t xml:space="preserve">10</w:t>
+            </w:r>
+          </w:p>
+        </w:tc>
+        <w:tc>
+          <w:tcPr>
+            <w:tcW w:type="dxa" w:w="1490"/>
+            <w:tcBorders>
+              <w:top w:val="single" w:color="A6A6A6" w:sz="4"/>
+              <w:left w:val="single" w:color="A6A6A6" w:sz="4"/>
+              <w:bottom w:val="single" w:color="A6A6A6" w:sz="4"/>
+              <w:right w:val="single" w:color="A6A6A6" w:sz="4"/>
+            </w:tcBorders>
+            <w:tcMar>
+              <w:top w:type="dxa" w:w="60"/>
+              <w:left w:type="dxa" w:w="100"/>
+              <w:bottom w:type="dxa" w:w="60"/>
+              <w:right w:type="dxa" w:w="100"/>
+            </w:tcMar>
+            <w:vAlign w:val="top"/>
+          </w:tcPr>
+          <w:p>
+            <w:pPr>
+              <w:spacing w:after="20" w:line="270"/>
+            </w:pPr>
+            <w:r>
+              <w:rPr>
+                <w:rFonts w:ascii="Arial" w:cs="Arial" w:eastAsia="Arial" w:hAnsi="Arial"/>
+                <w:sz w:val="19"/>
+                <w:szCs w:val="19"/>
+              </w:rPr>
+              <w:t xml:space="preserve">Quản lý</w:t>
+            </w:r>
+          </w:p>
+        </w:tc>
+        <w:tc>
+          <w:tcPr>
+            <w:tcW w:type="dxa" w:w="3974"/>
+            <w:tcBorders>
+              <w:top w:val="single" w:color="A6A6A6" w:sz="4"/>
+              <w:left w:val="single" w:color="A6A6A6" w:sz="4"/>
+              <w:bottom w:val="single" w:color="A6A6A6" w:sz="4"/>
+              <w:right w:val="single" w:color="A6A6A6" w:sz="4"/>
+            </w:tcBorders>
+            <w:tcMar>
+              <w:top w:type="dxa" w:w="60"/>
+              <w:left w:type="dxa" w:w="100"/>
+              <w:bottom w:type="dxa" w:w="60"/>
+              <w:right w:type="dxa" w:w="100"/>
+            </w:tcMar>
+            <w:vAlign w:val="top"/>
+          </w:tcPr>
+          <w:p>
+            <w:pPr>
+              <w:spacing w:after="20" w:line="270"/>
+            </w:pPr>
+            <w:r>
+              <w:rPr>
+                <w:rFonts w:ascii="Arial" w:cs="Arial" w:eastAsia="Arial" w:hAnsi="Arial"/>
+                <w:sz w:val="19"/>
+                <w:szCs w:val="19"/>
+              </w:rPr>
+              <w:t xml:space="preserve">Mở tab Giá vốn.</w:t>
+            </w:r>
+          </w:p>
+        </w:tc>
+        <w:tc>
+          <w:tcPr>
+            <w:tcW w:type="dxa" w:w="3578"/>
+            <w:tcBorders>
+              <w:top w:val="single" w:color="A6A6A6" w:sz="4"/>
+              <w:left w:val="single" w:color="A6A6A6" w:sz="4"/>
+              <w:bottom w:val="single" w:color="A6A6A6" w:sz="4"/>
+              <w:right w:val="single" w:color="A6A6A6" w:sz="4"/>
+            </w:tcBorders>
+            <w:tcMar>
+              <w:top w:type="dxa" w:w="60"/>
+              <w:left w:type="dxa" w:w="100"/>
+              <w:bottom w:type="dxa" w:w="60"/>
+              <w:right w:type="dxa" w:w="100"/>
+            </w:tcMar>
+            <w:vAlign w:val="top"/>
+          </w:tcPr>
+          <w:p>
+            <w:pPr>
+              <w:spacing w:after="20" w:line="270"/>
+            </w:pPr>
+            <w:r>
+              <w:rPr>
+                <w:rFonts w:ascii="Arial" w:cs="Arial" w:eastAsia="Arial" w:hAnsi="Arial"/>
+                <w:sz w:val="19"/>
+                <w:szCs w:val="19"/>
+              </w:rPr>
+              <w:t xml:space="preserve">Xem từng dòng: giá vốn ước tính, doanh thu thuần, lãi gộp và tỷ suất; dòng chưa có giá vốn được đánh dấu.</w:t>
+            </w:r>
+          </w:p>
+        </w:tc>
+      </w:tr>
+      <w:tr>
+        <w:trPr>
+          <w:cantSplit/>
+        </w:trPr>
+        <w:tc>
+          <w:tcPr>
+            <w:tcW w:type="dxa" w:w="596"/>
+            <w:tcBorders>
+              <w:top w:val="single" w:color="A6A6A6" w:sz="4"/>
+              <w:left w:val="single" w:color="A6A6A6" w:sz="4"/>
+              <w:bottom w:val="single" w:color="A6A6A6" w:sz="4"/>
+              <w:right w:val="single" w:color="A6A6A6" w:sz="4"/>
+            </w:tcBorders>
+            <w:tcMar>
+              <w:top w:type="dxa" w:w="60"/>
+              <w:left w:type="dxa" w:w="100"/>
+              <w:bottom w:type="dxa" w:w="60"/>
+              <w:right w:type="dxa" w:w="100"/>
+            </w:tcMar>
+            <w:vAlign w:val="top"/>
+          </w:tcPr>
+          <w:p>
+            <w:pPr>
+              <w:spacing w:after="20" w:line="270"/>
+            </w:pPr>
+            <w:r>
+              <w:rPr>
+                <w:rFonts w:ascii="Arial" w:cs="Arial" w:eastAsia="Arial" w:hAnsi="Arial"/>
+                <w:sz w:val="19"/>
+                <w:szCs w:val="19"/>
+              </w:rPr>
+              <w:t xml:space="preserve">11</w:t>
+            </w:r>
+          </w:p>
+        </w:tc>
+        <w:tc>
+          <w:tcPr>
+            <w:tcW w:type="dxa" w:w="1490"/>
+            <w:tcBorders>
+              <w:top w:val="single" w:color="A6A6A6" w:sz="4"/>
+              <w:left w:val="single" w:color="A6A6A6" w:sz="4"/>
+              <w:bottom w:val="single" w:color="A6A6A6" w:sz="4"/>
+              <w:right w:val="single" w:color="A6A6A6" w:sz="4"/>
+            </w:tcBorders>
+            <w:tcMar>
+              <w:top w:type="dxa" w:w="60"/>
+              <w:left w:type="dxa" w:w="100"/>
+              <w:bottom w:type="dxa" w:w="60"/>
+              <w:right w:type="dxa" w:w="100"/>
+            </w:tcMar>
+            <w:vAlign w:val="top"/>
+          </w:tcPr>
+          <w:p>
+            <w:pPr>
+              <w:spacing w:after="20" w:line="270"/>
+            </w:pPr>
+            <w:r>
+              <w:rPr>
+                <w:rFonts w:ascii="Arial" w:cs="Arial" w:eastAsia="Arial" w:hAnsi="Arial"/>
+                <w:sz w:val="19"/>
+                <w:szCs w:val="19"/>
+              </w:rPr>
+              <w:t xml:space="preserve">Người dùng</w:t>
+            </w:r>
+          </w:p>
+        </w:tc>
+        <w:tc>
+          <w:tcPr>
+            <w:tcW w:type="dxa" w:w="3974"/>
+            <w:tcBorders>
+              <w:top w:val="single" w:color="A6A6A6" w:sz="4"/>
+              <w:left w:val="single" w:color="A6A6A6" w:sz="4"/>
+              <w:bottom w:val="single" w:color="A6A6A6" w:sz="4"/>
+              <w:right w:val="single" w:color="A6A6A6" w:sz="4"/>
+            </w:tcBorders>
+            <w:tcMar>
+              <w:top w:type="dxa" w:w="60"/>
+              <w:left w:type="dxa" w:w="100"/>
+              <w:bottom w:type="dxa" w:w="60"/>
+              <w:right w:type="dxa" w:w="100"/>
+            </w:tcMar>
+            <w:vAlign w:val="top"/>
+          </w:tcPr>
+          <w:p>
+            <w:pPr>
+              <w:spacing w:after="20" w:line="270"/>
+            </w:pPr>
+            <w:r>
+              <w:rPr>
+                <w:rFonts w:ascii="Arial" w:cs="Arial" w:eastAsia="Arial" w:hAnsi="Arial"/>
+                <w:sz w:val="19"/>
+                <w:szCs w:val="19"/>
+              </w:rPr>
+              <w:t xml:space="preserve">Dùng nút ‹ › ở thanh dưới.</w:t>
+            </w:r>
+          </w:p>
+        </w:tc>
+        <w:tc>
+          <w:tcPr>
+            <w:tcW w:type="dxa" w:w="3578"/>
+            <w:tcBorders>
+              <w:top w:val="single" w:color="A6A6A6" w:sz="4"/>
+              <w:left w:val="single" w:color="A6A6A6" w:sz="4"/>
+              <w:bottom w:val="single" w:color="A6A6A6" w:sz="4"/>
+              <w:right w:val="single" w:color="A6A6A6" w:sz="4"/>
+            </w:tcBorders>
+            <w:tcMar>
+              <w:top w:type="dxa" w:w="60"/>
+              <w:left w:type="dxa" w:w="100"/>
+              <w:bottom w:type="dxa" w:w="60"/>
+              <w:right w:type="dxa" w:w="100"/>
+            </w:tcMar>
+            <w:vAlign w:val="top"/>
+          </w:tcPr>
+          <w:p>
+            <w:pPr>
+              <w:spacing w:after="20" w:line="270"/>
+            </w:pPr>
+            <w:r>
+              <w:rPr>
+                <w:rFonts w:ascii="Arial" w:cs="Arial" w:eastAsia="Arial" w:hAnsi="Arial"/>
+                <w:sz w:val="19"/>
+                <w:szCs w:val="19"/>
+              </w:rPr>
+              <w:t xml:space="preserve">Chuyển sang đơn liền trước / liền sau theo số chứng từ; hiện vị trí "23/26".</w:t>
+            </w:r>
+          </w:p>
+        </w:tc>
+      </w:tr>
     </w:tbl>
     <w:p>
       <w:pPr>
@@ -2437,6 +2824,341 @@
                 <w:szCs w:val="19"/>
               </w:rPr>
               <w:t xml:space="preserve">Mỗi dòng: Đặt · Đã giao · Còn lại · Giao lần này · Kho xuất · Tồn tại kho; ngày giao, ghi chú (ví dụ "Giao đợt 1, khách ký nhận"); hiện giá trị phải thu và hạn thanh toán; "Xác nhận giao hàng".</w:t>
+            </w:r>
+          </w:p>
+        </w:tc>
+      </w:tr>
+      <w:tr>
+        <w:trPr>
+          <w:cantSplit/>
+        </w:trPr>
+        <w:tc>
+          <w:tcPr>
+            <w:tcW w:type="dxa" w:w="2409"/>
+            <w:tcBorders>
+              <w:top w:val="single" w:color="A6A6A6" w:sz="4"/>
+              <w:left w:val="single" w:color="A6A6A6" w:sz="4"/>
+              <w:bottom w:val="single" w:color="A6A6A6" w:sz="4"/>
+              <w:right w:val="single" w:color="A6A6A6" w:sz="4"/>
+            </w:tcBorders>
+            <w:tcMar>
+              <w:top w:type="dxa" w:w="60"/>
+              <w:left w:type="dxa" w:w="100"/>
+              <w:bottom w:type="dxa" w:w="60"/>
+              <w:right w:type="dxa" w:w="100"/>
+            </w:tcMar>
+            <w:vAlign w:val="top"/>
+          </w:tcPr>
+          <w:p>
+            <w:pPr>
+              <w:spacing w:after="20" w:line="270"/>
+            </w:pPr>
+            <w:r>
+              <w:rPr>
+                <w:rFonts w:ascii="Arial" w:cs="Arial" w:eastAsia="Arial" w:hAnsi="Arial"/>
+                <w:sz w:val="19"/>
+                <w:szCs w:val="19"/>
+              </w:rPr>
+              <w:t xml:space="preserve">Thanh Thu tiền</w:t>
+            </w:r>
+          </w:p>
+        </w:tc>
+        <w:tc>
+          <w:tcPr>
+            <w:tcW w:type="dxa" w:w="7229"/>
+            <w:tcBorders>
+              <w:top w:val="single" w:color="A6A6A6" w:sz="4"/>
+              <w:left w:val="single" w:color="A6A6A6" w:sz="4"/>
+              <w:bottom w:val="single" w:color="A6A6A6" w:sz="4"/>
+              <w:right w:val="single" w:color="A6A6A6" w:sz="4"/>
+            </w:tcBorders>
+            <w:tcMar>
+              <w:top w:type="dxa" w:w="60"/>
+              <w:left w:type="dxa" w:w="100"/>
+              <w:bottom w:type="dxa" w:w="60"/>
+              <w:right w:type="dxa" w:w="100"/>
+            </w:tcMar>
+            <w:vAlign w:val="top"/>
+          </w:tcPr>
+          <w:p>
+            <w:pPr>
+              <w:spacing w:after="20" w:line="270"/>
+            </w:pPr>
+            <w:r>
+              <w:rPr>
+                <w:rFonts w:ascii="Arial" w:cs="Arial" w:eastAsia="Arial" w:hAnsi="Arial"/>
+                <w:sz w:val="19"/>
+                <w:szCs w:val="19"/>
+              </w:rPr>
+              <w:t xml:space="preserve">Trên đầu chứng từ: nút chọn Chưa thu tiền / Thu tiền ngay, kèm ô chọn tài khoản nhận tiền khi chọn Thu tiền ngay và một dòng giải thích. Đơn đã lưu chỉ hiện trạng thái (ví dụ "Thu tiền ngay · Quỹ tiền mặt").</w:t>
+            </w:r>
+          </w:p>
+        </w:tc>
+      </w:tr>
+      <w:tr>
+        <w:trPr>
+          <w:cantSplit/>
+        </w:trPr>
+        <w:tc>
+          <w:tcPr>
+            <w:tcW w:type="dxa" w:w="2409"/>
+            <w:tcBorders>
+              <w:top w:val="single" w:color="A6A6A6" w:sz="4"/>
+              <w:left w:val="single" w:color="A6A6A6" w:sz="4"/>
+              <w:bottom w:val="single" w:color="A6A6A6" w:sz="4"/>
+              <w:right w:val="single" w:color="A6A6A6" w:sz="4"/>
+            </w:tcBorders>
+            <w:tcMar>
+              <w:top w:type="dxa" w:w="60"/>
+              <w:left w:type="dxa" w:w="100"/>
+              <w:bottom w:type="dxa" w:w="60"/>
+              <w:right w:type="dxa" w:w="100"/>
+            </w:tcMar>
+            <w:vAlign w:val="top"/>
+          </w:tcPr>
+          <w:p>
+            <w:pPr>
+              <w:spacing w:after="20" w:line="270"/>
+            </w:pPr>
+            <w:r>
+              <w:rPr>
+                <w:rFonts w:ascii="Arial" w:cs="Arial" w:eastAsia="Arial" w:hAnsi="Arial"/>
+                <w:sz w:val="19"/>
+                <w:szCs w:val="19"/>
+              </w:rPr>
+              <w:t xml:space="preserve">Tham chiếu</w:t>
+            </w:r>
+          </w:p>
+        </w:tc>
+        <w:tc>
+          <w:tcPr>
+            <w:tcW w:type="dxa" w:w="7229"/>
+            <w:tcBorders>
+              <w:top w:val="single" w:color="A6A6A6" w:sz="4"/>
+              <w:left w:val="single" w:color="A6A6A6" w:sz="4"/>
+              <w:bottom w:val="single" w:color="A6A6A6" w:sz="4"/>
+              <w:right w:val="single" w:color="A6A6A6" w:sz="4"/>
+            </w:tcBorders>
+            <w:tcMar>
+              <w:top w:type="dxa" w:w="60"/>
+              <w:left w:type="dxa" w:w="100"/>
+              <w:bottom w:type="dxa" w:w="60"/>
+              <w:right w:type="dxa" w:w="100"/>
+            </w:tcMar>
+            <w:vAlign w:val="top"/>
+          </w:tcPr>
+          <w:p>
+            <w:pPr>
+              <w:spacing w:after="20" w:line="270"/>
+            </w:pPr>
+            <w:r>
+              <w:rPr>
+                <w:rFonts w:ascii="Arial" w:cs="Arial" w:eastAsia="Arial" w:hAnsi="Arial"/>
+                <w:sz w:val="19"/>
+                <w:szCs w:val="19"/>
+              </w:rPr>
+              <w:t xml:space="preserve">Dòng cuối khối đầu phiếu: các chứng từ liên quan của đơn là chuyến giao hàng, phiếu xuất kho, lệnh sản xuất và phiếu thu; bấm để mở. Phiếu xuất kho và phiếu thu cũng có đường dẫn ngược về đơn.</w:t>
+            </w:r>
+          </w:p>
+        </w:tc>
+      </w:tr>
+      <w:tr>
+        <w:trPr>
+          <w:cantSplit/>
+        </w:trPr>
+        <w:tc>
+          <w:tcPr>
+            <w:tcW w:type="dxa" w:w="2409"/>
+            <w:tcBorders>
+              <w:top w:val="single" w:color="A6A6A6" w:sz="4"/>
+              <w:left w:val="single" w:color="A6A6A6" w:sz="4"/>
+              <w:bottom w:val="single" w:color="A6A6A6" w:sz="4"/>
+              <w:right w:val="single" w:color="A6A6A6" w:sz="4"/>
+            </w:tcBorders>
+            <w:tcMar>
+              <w:top w:type="dxa" w:w="60"/>
+              <w:left w:type="dxa" w:w="100"/>
+              <w:bottom w:type="dxa" w:w="60"/>
+              <w:right w:type="dxa" w:w="100"/>
+            </w:tcMar>
+            <w:vAlign w:val="top"/>
+          </w:tcPr>
+          <w:p>
+            <w:pPr>
+              <w:spacing w:after="20" w:line="270"/>
+            </w:pPr>
+            <w:r>
+              <w:rPr>
+                <w:rFonts w:ascii="Arial" w:cs="Arial" w:eastAsia="Arial" w:hAnsi="Arial"/>
+                <w:sz w:val="19"/>
+                <w:szCs w:val="19"/>
+              </w:rPr>
+              <w:t xml:space="preserve">Tab Giá vốn</w:t>
+            </w:r>
+          </w:p>
+        </w:tc>
+        <w:tc>
+          <w:tcPr>
+            <w:tcW w:type="dxa" w:w="7229"/>
+            <w:tcBorders>
+              <w:top w:val="single" w:color="A6A6A6" w:sz="4"/>
+              <w:left w:val="single" w:color="A6A6A6" w:sz="4"/>
+              <w:bottom w:val="single" w:color="A6A6A6" w:sz="4"/>
+              <w:right w:val="single" w:color="A6A6A6" w:sz="4"/>
+            </w:tcBorders>
+            <w:tcMar>
+              <w:top w:type="dxa" w:w="60"/>
+              <w:left w:type="dxa" w:w="100"/>
+              <w:bottom w:type="dxa" w:w="60"/>
+              <w:right w:type="dxa" w:w="100"/>
+            </w:tcMar>
+            <w:vAlign w:val="top"/>
+          </w:tcPr>
+          <w:p>
+            <w:pPr>
+              <w:spacing w:after="20" w:line="270"/>
+            </w:pPr>
+            <w:r>
+              <w:rPr>
+                <w:rFonts w:ascii="Arial" w:cs="Arial" w:eastAsia="Arial" w:hAnsi="Arial"/>
+                <w:sz w:val="19"/>
+                <w:szCs w:val="19"/>
+              </w:rPr>
+              <w:t xml:space="preserve">Bảng cùng dòng hàng với tab Hàng hoá: giá vốn / ĐVT, giá vốn thành tiền, doanh thu thuần, lãi gộp, tỷ suất; dòng Cộng; chú thích đây là giá vốn ước tính.</w:t>
+            </w:r>
+          </w:p>
+        </w:tc>
+      </w:tr>
+      <w:tr>
+        <w:trPr>
+          <w:cantSplit/>
+        </w:trPr>
+        <w:tc>
+          <w:tcPr>
+            <w:tcW w:type="dxa" w:w="2409"/>
+            <w:tcBorders>
+              <w:top w:val="single" w:color="A6A6A6" w:sz="4"/>
+              <w:left w:val="single" w:color="A6A6A6" w:sz="4"/>
+              <w:bottom w:val="single" w:color="A6A6A6" w:sz="4"/>
+              <w:right w:val="single" w:color="A6A6A6" w:sz="4"/>
+            </w:tcBorders>
+            <w:tcMar>
+              <w:top w:type="dxa" w:w="60"/>
+              <w:left w:type="dxa" w:w="100"/>
+              <w:bottom w:type="dxa" w:w="60"/>
+              <w:right w:type="dxa" w:w="100"/>
+            </w:tcMar>
+            <w:vAlign w:val="top"/>
+          </w:tcPr>
+          <w:p>
+            <w:pPr>
+              <w:spacing w:after="20" w:line="270"/>
+            </w:pPr>
+            <w:r>
+              <w:rPr>
+                <w:rFonts w:ascii="Arial" w:cs="Arial" w:eastAsia="Arial" w:hAnsi="Arial"/>
+                <w:sz w:val="19"/>
+                <w:szCs w:val="19"/>
+              </w:rPr>
+              <w:t xml:space="preserve">Chuyển chứng từ</w:t>
+            </w:r>
+          </w:p>
+        </w:tc>
+        <w:tc>
+          <w:tcPr>
+            <w:tcW w:type="dxa" w:w="7229"/>
+            <w:tcBorders>
+              <w:top w:val="single" w:color="A6A6A6" w:sz="4"/>
+              <w:left w:val="single" w:color="A6A6A6" w:sz="4"/>
+              <w:bottom w:val="single" w:color="A6A6A6" w:sz="4"/>
+              <w:right w:val="single" w:color="A6A6A6" w:sz="4"/>
+            </w:tcBorders>
+            <w:tcMar>
+              <w:top w:type="dxa" w:w="60"/>
+              <w:left w:type="dxa" w:w="100"/>
+              <w:bottom w:type="dxa" w:w="60"/>
+              <w:right w:type="dxa" w:w="100"/>
+            </w:tcMar>
+            <w:vAlign w:val="top"/>
+          </w:tcPr>
+          <w:p>
+            <w:pPr>
+              <w:spacing w:after="20" w:line="270"/>
+            </w:pPr>
+            <w:r>
+              <w:rPr>
+                <w:rFonts w:ascii="Arial" w:cs="Arial" w:eastAsia="Arial" w:hAnsi="Arial"/>
+                <w:sz w:val="19"/>
+                <w:szCs w:val="19"/>
+              </w:rPr>
+              <w:t xml:space="preserve">Hai nút ‹ › và vị trí đơn trong tổng số ở góc trái thanh hành động (chỉ khi xem đơn đã lưu).</w:t>
+            </w:r>
+          </w:p>
+        </w:tc>
+      </w:tr>
+      <w:tr>
+        <w:trPr>
+          <w:cantSplit/>
+        </w:trPr>
+        <w:tc>
+          <w:tcPr>
+            <w:tcW w:type="dxa" w:w="2409"/>
+            <w:tcBorders>
+              <w:top w:val="single" w:color="A6A6A6" w:sz="4"/>
+              <w:left w:val="single" w:color="A6A6A6" w:sz="4"/>
+              <w:bottom w:val="single" w:color="A6A6A6" w:sz="4"/>
+              <w:right w:val="single" w:color="A6A6A6" w:sz="4"/>
+            </w:tcBorders>
+            <w:tcMar>
+              <w:top w:type="dxa" w:w="60"/>
+              <w:left w:type="dxa" w:w="100"/>
+              <w:bottom w:type="dxa" w:w="60"/>
+              <w:right w:type="dxa" w:w="100"/>
+            </w:tcMar>
+            <w:vAlign w:val="top"/>
+          </w:tcPr>
+          <w:p>
+            <w:pPr>
+              <w:spacing w:after="20" w:line="270"/>
+            </w:pPr>
+            <w:r>
+              <w:rPr>
+                <w:rFonts w:ascii="Arial" w:cs="Arial" w:eastAsia="Arial" w:hAnsi="Arial"/>
+                <w:sz w:val="19"/>
+                <w:szCs w:val="19"/>
+              </w:rPr>
+              <w:t xml:space="preserve">Loại khách · bảng giá</w:t>
+            </w:r>
+          </w:p>
+        </w:tc>
+        <w:tc>
+          <w:tcPr>
+            <w:tcW w:type="dxa" w:w="7229"/>
+            <w:tcBorders>
+              <w:top w:val="single" w:color="A6A6A6" w:sz="4"/>
+              <w:left w:val="single" w:color="A6A6A6" w:sz="4"/>
+              <w:bottom w:val="single" w:color="A6A6A6" w:sz="4"/>
+              <w:right w:val="single" w:color="A6A6A6" w:sz="4"/>
+            </w:tcBorders>
+            <w:tcMar>
+              <w:top w:type="dxa" w:w="60"/>
+              <w:left w:type="dxa" w:w="100"/>
+              <w:bottom w:type="dxa" w:w="60"/>
+              <w:right w:type="dxa" w:w="100"/>
+            </w:tcMar>
+            <w:vAlign w:val="top"/>
+          </w:tcPr>
+          <w:p>
+            <w:pPr>
+              <w:spacing w:after="20" w:line="270"/>
+            </w:pPr>
+            <w:r>
+              <w:rPr>
+                <w:rFonts w:ascii="Arial" w:cs="Arial" w:eastAsia="Arial" w:hAnsi="Arial"/>
+                <w:sz w:val="19"/>
+                <w:szCs w:val="19"/>
+              </w:rPr>
+              <w:t xml:space="preserve">Trường ghi rõ loại khách và bảng giá (ví dụ "Khách lẻ · giá lẻ"). Chip cạnh tên khách chỉ nói điều khoản thanh toán (Trả ngay / Được nợ N ngày). Thẻ đánh dấu (như "Khách quen") là nhãn riêng, không phải loại khách.</w:t>
             </w:r>
           </w:p>
         </w:tc>
@@ -3727,6 +4449,114 @@
     </w:p>
     <w:p>
       <w:pPr>
+        <w:pStyle w:val="ListParagraph"/>
+        <w:numPr>
+          <w:ilvl w:val="0"/>
+          <w:numId w:val="3"/>
+        </w:numPr>
+        <w:spacing w:after="70" w:line="290"/>
+      </w:pPr>
+      <w:r>
+        <w:rPr>
+          <w:rFonts w:ascii="Arial" w:cs="Arial" w:eastAsia="Arial" w:hAnsi="Arial"/>
+          <w:sz w:val="21"/>
+          <w:szCs w:val="21"/>
+        </w:rPr>
+        <w:t xml:space="preserve"/>
+      </w:r>
+      <w:r>
+        <w:rPr>
+          <w:rFonts w:ascii="Arial" w:cs="Arial" w:eastAsia="Arial" w:hAnsi="Arial"/>
+          <w:b/>
+          <w:bCs/>
+          <w:sz w:val="21"/>
+          <w:szCs w:val="21"/>
+        </w:rPr>
+        <w:t xml:space="preserve">Thu tiền ngay:</w:t>
+      </w:r>
+      <w:r>
+        <w:rPr>
+          <w:rFonts w:ascii="Arial" w:cs="Arial" w:eastAsia="Arial" w:hAnsi="Arial"/>
+          <w:sz w:val="21"/>
+          <w:szCs w:val="21"/>
+        </w:rPr>
+        <w:t xml:space="preserve"> mỗi lần khách nhận hàng (giao trực tiếp hoặc chốt giao trên chuyến), hệ thống tự lập một phiếu thu đúng phần vừa nhận vào tài khoản đã chọn, đối trừ thẳng vào đơn này; công nợ của đơn về 0. Bỏ chốt giao thì phiếu thu tự lập gần nhất được huỷ. Chọn Thu tiền ngay mà chưa chọn tài khoản thì không lưu được.</w:t>
+      </w:r>
+    </w:p>
+    <w:p>
+      <w:pPr>
+        <w:pStyle w:val="ListParagraph"/>
+        <w:numPr>
+          <w:ilvl w:val="0"/>
+          <w:numId w:val="3"/>
+        </w:numPr>
+        <w:spacing w:after="70" w:line="290"/>
+      </w:pPr>
+      <w:r>
+        <w:rPr>
+          <w:rFonts w:ascii="Arial" w:cs="Arial" w:eastAsia="Arial" w:hAnsi="Arial"/>
+          <w:sz w:val="21"/>
+          <w:szCs w:val="21"/>
+        </w:rPr>
+        <w:t xml:space="preserve"/>
+      </w:r>
+      <w:r>
+        <w:rPr>
+          <w:rFonts w:ascii="Arial" w:cs="Arial" w:eastAsia="Arial" w:hAnsi="Arial"/>
+          <w:b/>
+          <w:bCs/>
+          <w:sz w:val="21"/>
+          <w:szCs w:val="21"/>
+        </w:rPr>
+        <w:t xml:space="preserve">Giá vốn trên chứng từ</w:t>
+      </w:r>
+      <w:r>
+        <w:rPr>
+          <w:rFonts w:ascii="Arial" w:cs="Arial" w:eastAsia="Arial" w:hAnsi="Arial"/>
+          <w:sz w:val="21"/>
+          <w:szCs w:val="21"/>
+        </w:rPr>
+        <w:t xml:space="preserve"> là ước tính (giá nhập gần nhất; thành phẩm = định mức × giá vật tư; dịch vụ không có giá vốn), tính theo số lượng đặt; chưa phải giá vốn chốt khi giao.</w:t>
+      </w:r>
+    </w:p>
+    <w:p>
+      <w:pPr>
+        <w:pStyle w:val="ListParagraph"/>
+        <w:numPr>
+          <w:ilvl w:val="0"/>
+          <w:numId w:val="3"/>
+        </w:numPr>
+        <w:spacing w:after="70" w:line="290"/>
+      </w:pPr>
+      <w:r>
+        <w:rPr>
+          <w:rFonts w:ascii="Arial" w:cs="Arial" w:eastAsia="Arial" w:hAnsi="Arial"/>
+          <w:sz w:val="21"/>
+          <w:szCs w:val="21"/>
+        </w:rPr>
+        <w:t xml:space="preserve"/>
+      </w:r>
+      <w:r>
+        <w:rPr>
+          <w:rFonts w:ascii="Arial" w:cs="Arial" w:eastAsia="Arial" w:hAnsi="Arial"/>
+          <w:b/>
+          <w:bCs/>
+          <w:sz w:val="21"/>
+          <w:szCs w:val="21"/>
+        </w:rPr>
+        <w:t xml:space="preserve">Tham chiếu</w:t>
+      </w:r>
+      <w:r>
+        <w:rPr>
+          <w:rFonts w:ascii="Arial" w:cs="Arial" w:eastAsia="Arial" w:hAnsi="Arial"/>
+          <w:sz w:val="21"/>
+          <w:szCs w:val="21"/>
+        </w:rPr>
+        <w:t xml:space="preserve"> chỉ liệt kê chứng từ chưa huỷ. Phiếu thu được nhận ra khi đối trừ thẳng vào đơn (Thu tiền ngay hoặc chọn tay) hoặc diễn giải có ghi số đơn.</w:t>
+      </w:r>
+    </w:p>
+    <w:p>
+      <w:pPr>
         <w:pStyle w:val="Heading1"/>
         <w:keepNext/>
         <w:spacing w:after="120" w:before="320"/>
@@ -4550,6 +5380,104 @@
                 <w:szCs w:val="19"/>
               </w:rPr>
               <w:t xml:space="preserve">Trạng thái, chuyến đang chạy, ngày kết thúc, lý do huỷ.</w:t>
+            </w:r>
+          </w:p>
+        </w:tc>
+      </w:tr>
+      <w:tr>
+        <w:trPr>
+          <w:cantSplit/>
+        </w:trPr>
+        <w:tc>
+          <w:tcPr>
+            <w:tcW w:type="dxa" w:w="2409"/>
+            <w:tcBorders>
+              <w:top w:val="single" w:color="A6A6A6" w:sz="4"/>
+              <w:left w:val="single" w:color="A6A6A6" w:sz="4"/>
+              <w:bottom w:val="single" w:color="A6A6A6" w:sz="4"/>
+              <w:right w:val="single" w:color="A6A6A6" w:sz="4"/>
+            </w:tcBorders>
+            <w:tcMar>
+              <w:top w:type="dxa" w:w="60"/>
+              <w:left w:type="dxa" w:w="100"/>
+              <w:bottom w:type="dxa" w:w="60"/>
+              <w:right w:type="dxa" w:w="100"/>
+            </w:tcMar>
+            <w:vAlign w:val="top"/>
+          </w:tcPr>
+          <w:p>
+            <w:pPr>
+              <w:spacing w:after="20" w:line="270"/>
+            </w:pPr>
+            <w:r>
+              <w:rPr>
+                <w:rFonts w:ascii="Arial" w:cs="Arial" w:eastAsia="Arial" w:hAnsi="Arial"/>
+                <w:sz w:val="19"/>
+                <w:szCs w:val="19"/>
+              </w:rPr>
+              <w:t xml:space="preserve">payNowAccountId</w:t>
+            </w:r>
+          </w:p>
+        </w:tc>
+        <w:tc>
+          <w:tcPr>
+            <w:tcW w:type="dxa" w:w="2007"/>
+            <w:tcBorders>
+              <w:top w:val="single" w:color="A6A6A6" w:sz="4"/>
+              <w:left w:val="single" w:color="A6A6A6" w:sz="4"/>
+              <w:bottom w:val="single" w:color="A6A6A6" w:sz="4"/>
+              <w:right w:val="single" w:color="A6A6A6" w:sz="4"/>
+            </w:tcBorders>
+            <w:tcMar>
+              <w:top w:type="dxa" w:w="60"/>
+              <w:left w:type="dxa" w:w="100"/>
+              <w:bottom w:type="dxa" w:w="60"/>
+              <w:right w:type="dxa" w:w="100"/>
+            </w:tcMar>
+            <w:vAlign w:val="top"/>
+          </w:tcPr>
+          <w:p>
+            <w:pPr>
+              <w:spacing w:after="20" w:line="270"/>
+            </w:pPr>
+            <w:r>
+              <w:rPr>
+                <w:rFonts w:ascii="Arial" w:cs="Arial" w:eastAsia="Arial" w:hAnsi="Arial"/>
+                <w:sz w:val="19"/>
+                <w:szCs w:val="19"/>
+              </w:rPr>
+              <w:t xml:space="preserve">Mã tài khoản</w:t>
+            </w:r>
+          </w:p>
+        </w:tc>
+        <w:tc>
+          <w:tcPr>
+            <w:tcW w:type="dxa" w:w="5222"/>
+            <w:tcBorders>
+              <w:top w:val="single" w:color="A6A6A6" w:sz="4"/>
+              <w:left w:val="single" w:color="A6A6A6" w:sz="4"/>
+              <w:bottom w:val="single" w:color="A6A6A6" w:sz="4"/>
+              <w:right w:val="single" w:color="A6A6A6" w:sz="4"/>
+            </w:tcBorders>
+            <w:tcMar>
+              <w:top w:type="dxa" w:w="60"/>
+              <w:left w:type="dxa" w:w="100"/>
+              <w:bottom w:type="dxa" w:w="60"/>
+              <w:right w:type="dxa" w:w="100"/>
+            </w:tcMar>
+            <w:vAlign w:val="top"/>
+          </w:tcPr>
+          <w:p>
+            <w:pPr>
+              <w:spacing w:after="20" w:line="270"/>
+            </w:pPr>
+            <w:r>
+              <w:rPr>
+                <w:rFonts w:ascii="Arial" w:cs="Arial" w:eastAsia="Arial" w:hAnsi="Arial"/>
+                <w:sz w:val="19"/>
+                <w:szCs w:val="19"/>
+              </w:rPr>
+              <w:t xml:space="preserve">Tài khoản nhận tiền khi chọn "Thu tiền ngay"; trống = chưa thu tiền.</w:t>
             </w:r>
           </w:p>
         </w:tc>
@@ -4931,6 +5859,73 @@
           </w:p>
         </w:tc>
       </w:tr>
+      <w:tr>
+        <w:trPr>
+          <w:cantSplit/>
+        </w:trPr>
+        <w:tc>
+          <w:tcPr>
+            <w:tcW w:type="dxa" w:w="3011"/>
+            <w:tcBorders>
+              <w:top w:val="single" w:color="A6A6A6" w:sz="4"/>
+              <w:left w:val="single" w:color="A6A6A6" w:sz="4"/>
+              <w:bottom w:val="single" w:color="A6A6A6" w:sz="4"/>
+              <w:right w:val="single" w:color="A6A6A6" w:sz="4"/>
+            </w:tcBorders>
+            <w:tcMar>
+              <w:top w:type="dxa" w:w="60"/>
+              <w:left w:type="dxa" w:w="100"/>
+              <w:bottom w:type="dxa" w:w="60"/>
+              <w:right w:type="dxa" w:w="100"/>
+            </w:tcMar>
+            <w:vAlign w:val="top"/>
+          </w:tcPr>
+          <w:p>
+            <w:pPr>
+              <w:spacing w:after="20" w:line="270"/>
+            </w:pPr>
+            <w:r>
+              <w:rPr>
+                <w:rFonts w:ascii="Arial" w:cs="Arial" w:eastAsia="Arial" w:hAnsi="Arial"/>
+                <w:sz w:val="19"/>
+                <w:szCs w:val="19"/>
+              </w:rPr>
+              <w:t xml:space="preserve">Giao hàng khi đã chọn Thu tiền ngay</w:t>
+            </w:r>
+          </w:p>
+        </w:tc>
+        <w:tc>
+          <w:tcPr>
+            <w:tcW w:type="dxa" w:w="6627"/>
+            <w:tcBorders>
+              <w:top w:val="single" w:color="A6A6A6" w:sz="4"/>
+              <w:left w:val="single" w:color="A6A6A6" w:sz="4"/>
+              <w:bottom w:val="single" w:color="A6A6A6" w:sz="4"/>
+              <w:right w:val="single" w:color="A6A6A6" w:sz="4"/>
+            </w:tcBorders>
+            <w:tcMar>
+              <w:top w:type="dxa" w:w="60"/>
+              <w:left w:type="dxa" w:w="100"/>
+              <w:bottom w:type="dxa" w:w="60"/>
+              <w:right w:type="dxa" w:w="100"/>
+            </w:tcMar>
+            <w:vAlign w:val="top"/>
+          </w:tcPr>
+          <w:p>
+            <w:pPr>
+              <w:spacing w:after="20" w:line="270"/>
+            </w:pPr>
+            <w:r>
+              <w:rPr>
+                <w:rFonts w:ascii="Arial" w:cs="Arial" w:eastAsia="Arial" w:hAnsi="Arial"/>
+                <w:sz w:val="19"/>
+                <w:szCs w:val="19"/>
+              </w:rPr>
+              <w:t xml:space="preserve">Ngoài phiếu xuất kho và công nợ: tự lập phiếu thu, tăng số dư tài khoản, trừ hết công nợ của lần giao.</w:t>
+            </w:r>
+          </w:p>
+        </w:tc>
+      </w:tr>
     </w:tbl>
     <w:p>
       <w:pPr>
@@ -5438,6 +6433,73 @@
                 <w:szCs w:val="19"/>
               </w:rPr>
               <w:t xml:space="preserve">Gắn thẻ; nguồn số liệu doanh thu.</w:t>
+            </w:r>
+          </w:p>
+        </w:tc>
+      </w:tr>
+      <w:tr>
+        <w:trPr>
+          <w:cantSplit/>
+        </w:trPr>
+        <w:tc>
+          <w:tcPr>
+            <w:tcW w:type="dxa" w:w="2610"/>
+            <w:tcBorders>
+              <w:top w:val="single" w:color="A6A6A6" w:sz="4"/>
+              <w:left w:val="single" w:color="A6A6A6" w:sz="4"/>
+              <w:bottom w:val="single" w:color="A6A6A6" w:sz="4"/>
+              <w:right w:val="single" w:color="A6A6A6" w:sz="4"/>
+            </w:tcBorders>
+            <w:tcMar>
+              <w:top w:type="dxa" w:w="60"/>
+              <w:left w:type="dxa" w:w="100"/>
+              <w:bottom w:type="dxa" w:w="60"/>
+              <w:right w:type="dxa" w:w="100"/>
+            </w:tcMar>
+            <w:vAlign w:val="top"/>
+          </w:tcPr>
+          <w:p>
+            <w:pPr>
+              <w:spacing w:after="20" w:line="270"/>
+            </w:pPr>
+            <w:r>
+              <w:rPr>
+                <w:rFonts w:ascii="Arial" w:cs="Arial" w:eastAsia="Arial" w:hAnsi="Arial"/>
+                <w:sz w:val="19"/>
+                <w:szCs w:val="19"/>
+              </w:rPr>
+              <w:t xml:space="preserve">Phiếu thu chi (ATL-16)</w:t>
+            </w:r>
+          </w:p>
+        </w:tc>
+        <w:tc>
+          <w:tcPr>
+            <w:tcW w:type="dxa" w:w="7028"/>
+            <w:tcBorders>
+              <w:top w:val="single" w:color="A6A6A6" w:sz="4"/>
+              <w:left w:val="single" w:color="A6A6A6" w:sz="4"/>
+              <w:bottom w:val="single" w:color="A6A6A6" w:sz="4"/>
+              <w:right w:val="single" w:color="A6A6A6" w:sz="4"/>
+            </w:tcBorders>
+            <w:tcMar>
+              <w:top w:type="dxa" w:w="60"/>
+              <w:left w:type="dxa" w:w="100"/>
+              <w:bottom w:type="dxa" w:w="60"/>
+              <w:right w:type="dxa" w:w="100"/>
+            </w:tcMar>
+            <w:vAlign w:val="top"/>
+          </w:tcPr>
+          <w:p>
+            <w:pPr>
+              <w:spacing w:after="20" w:line="270"/>
+            </w:pPr>
+            <w:r>
+              <w:rPr>
+                <w:rFonts w:ascii="Arial" w:cs="Arial" w:eastAsia="Arial" w:hAnsi="Arial"/>
+                <w:sz w:val="19"/>
+                <w:szCs w:val="19"/>
+              </w:rPr>
+              <w:t xml:space="preserve">Phiếu thu tự lập khi Thu tiền ngay; dòng đối trừ trong phiếu bấm mở về đơn.</w:t>
             </w:r>
           </w:p>
         </w:tc>
@@ -5815,6 +6877,73 @@
                 <w:szCs w:val="19"/>
               </w:rPr>
               <w:t xml:space="preserve">Tự chuyển sang /don-hang/them-moi.</w:t>
+            </w:r>
+          </w:p>
+        </w:tc>
+      </w:tr>
+      <w:tr>
+        <w:trPr>
+          <w:cantSplit/>
+        </w:trPr>
+        <w:tc>
+          <w:tcPr>
+            <w:tcW w:type="dxa" w:w="3614"/>
+            <w:tcBorders>
+              <w:top w:val="single" w:color="A6A6A6" w:sz="4"/>
+              <w:left w:val="single" w:color="A6A6A6" w:sz="4"/>
+              <w:bottom w:val="single" w:color="A6A6A6" w:sz="4"/>
+              <w:right w:val="single" w:color="A6A6A6" w:sz="4"/>
+            </w:tcBorders>
+            <w:tcMar>
+              <w:top w:type="dxa" w:w="60"/>
+              <w:left w:type="dxa" w:w="100"/>
+              <w:bottom w:type="dxa" w:w="60"/>
+              <w:right w:type="dxa" w:w="100"/>
+            </w:tcMar>
+            <w:vAlign w:val="top"/>
+          </w:tcPr>
+          <w:p>
+            <w:pPr>
+              <w:spacing w:after="20" w:line="270"/>
+            </w:pPr>
+            <w:r>
+              <w:rPr>
+                <w:rFonts w:ascii="Arial" w:cs="Arial" w:eastAsia="Arial" w:hAnsi="Arial"/>
+                <w:sz w:val="19"/>
+                <w:szCs w:val="19"/>
+              </w:rPr>
+              <w:t xml:space="preserve">Thu tiền ngay mà tài khoản đã bị ngừng dùng</w:t>
+            </w:r>
+          </w:p>
+        </w:tc>
+        <w:tc>
+          <w:tcPr>
+            <w:tcW w:type="dxa" w:w="6024"/>
+            <w:tcBorders>
+              <w:top w:val="single" w:color="A6A6A6" w:sz="4"/>
+              <w:left w:val="single" w:color="A6A6A6" w:sz="4"/>
+              <w:bottom w:val="single" w:color="A6A6A6" w:sz="4"/>
+              <w:right w:val="single" w:color="A6A6A6" w:sz="4"/>
+            </w:tcBorders>
+            <w:tcMar>
+              <w:top w:type="dxa" w:w="60"/>
+              <w:left w:type="dxa" w:w="100"/>
+              <w:bottom w:type="dxa" w:w="60"/>
+              <w:right w:type="dxa" w:w="100"/>
+            </w:tcMar>
+            <w:vAlign w:val="top"/>
+          </w:tcPr>
+          <w:p>
+            <w:pPr>
+              <w:spacing w:after="20" w:line="270"/>
+            </w:pPr>
+            <w:r>
+              <w:rPr>
+                <w:rFonts w:ascii="Arial" w:cs="Arial" w:eastAsia="Arial" w:hAnsi="Arial"/>
+                <w:sz w:val="19"/>
+                <w:szCs w:val="19"/>
+              </w:rPr>
+              <w:t xml:space="preserve">Không tự lập phiếu thu; đơn vẫn giao và ghi công nợ bình thường.</w:t>
             </w:r>
           </w:p>
         </w:tc>
@@ -5926,6 +7055,24 @@
           <w:szCs w:val="21"/>
         </w:rPr>
         <w:t xml:space="preserve">Trạng thái đơn không sửa tay: luôn suy ra từ giao hàng và sản xuất.</w:t>
+      </w:r>
+    </w:p>
+    <w:p>
+      <w:pPr>
+        <w:pStyle w:val="ListParagraph"/>
+        <w:numPr>
+          <w:ilvl w:val="0"/>
+          <w:numId w:val="2"/>
+        </w:numPr>
+        <w:spacing w:after="60" w:line="290"/>
+      </w:pPr>
+      <w:r>
+        <w:rPr>
+          <w:rFonts w:ascii="Arial" w:cs="Arial" w:eastAsia="Arial" w:hAnsi="Arial"/>
+          <w:sz w:val="21"/>
+          <w:szCs w:val="21"/>
+        </w:rPr>
+        <w:t xml:space="preserve">Chưa có cột tài khoản kế toán, hoá đơn điện tử và mã cơ quan thuế như MISA — hệ thống chưa có hệ thống tài khoản; cân nhắc khi cần nối kế toán.</w:t>
       </w:r>
     </w:p>
     <w:p>

</xml_diff>